<commit_message>
fix: CI pipeline — fix K8s validation and Node 20 deprecation
- K8s validation now uses --validate=false (no live cluster in CI)
- Namespace applied first, then remaining manifests
- Replaced azure/setup-kubectl@v4 (deprecated Node 20) with direct
  kubectl binary install
</commit_message>
<xml_diff>
--- a/report_output/RoomEase_CICD_Project_Report.docx
+++ b/report_output/RoomEase_CICD_Project_Report.docx
@@ -1837,13 +1837,13 @@
         <w:tblLook w:firstColumn="1" w:firstRow="1" w:lastColumn="0" w:lastRow="0" w:noHBand="0" w:noVBand="1" w:val="04A0"/>
       </w:tblPr>
       <w:tblGrid>
-        <w:gridCol w:w="5340"/>
-        <w:gridCol w:w="5340"/>
+        <w:gridCol w:w="5342"/>
+        <w:gridCol w:w="5342"/>
       </w:tblGrid>
       <w:tr>
         <w:tc>
           <w:tcPr>
-            <w:tcW w:type="dxa" w:w="5340"/>
+            <w:tcW w:type="dxa" w:w="5342"/>
           </w:tcPr>
           <w:p>
             <w:pPr>
@@ -1864,7 +1864,7 @@
         </w:tc>
         <w:tc>
           <w:tcPr>
-            <w:tcW w:type="dxa" w:w="5340"/>
+            <w:tcW w:type="dxa" w:w="5342"/>
           </w:tcPr>
           <w:p>
             <w:pPr>
@@ -1887,7 +1887,7 @@
       <w:tr>
         <w:tc>
           <w:tcPr>
-            <w:tcW w:type="dxa" w:w="5340"/>
+            <w:tcW w:type="dxa" w:w="5342"/>
           </w:tcPr>
           <w:p>
             <w:pPr>
@@ -1908,7 +1908,7 @@
         </w:tc>
         <w:tc>
           <w:tcPr>
-            <w:tcW w:type="dxa" w:w="5340"/>
+            <w:tcW w:type="dxa" w:w="5342"/>
           </w:tcPr>
           <w:p>
             <w:pPr>
@@ -1931,7 +1931,7 @@
       <w:tr>
         <w:tc>
           <w:tcPr>
-            <w:tcW w:type="dxa" w:w="5340"/>
+            <w:tcW w:type="dxa" w:w="5342"/>
           </w:tcPr>
           <w:p>
             <w:pPr>
@@ -1952,7 +1952,7 @@
         </w:tc>
         <w:tc>
           <w:tcPr>
-            <w:tcW w:type="dxa" w:w="5340"/>
+            <w:tcW w:type="dxa" w:w="5342"/>
           </w:tcPr>
           <w:p>
             <w:pPr>
@@ -1975,7 +1975,7 @@
       <w:tr>
         <w:tc>
           <w:tcPr>
-            <w:tcW w:type="dxa" w:w="5340"/>
+            <w:tcW w:type="dxa" w:w="5342"/>
           </w:tcPr>
           <w:p>
             <w:pPr>
@@ -1996,7 +1996,7 @@
         </w:tc>
         <w:tc>
           <w:tcPr>
-            <w:tcW w:type="dxa" w:w="5340"/>
+            <w:tcW w:type="dxa" w:w="5342"/>
           </w:tcPr>
           <w:p>
             <w:pPr>
@@ -2019,7 +2019,7 @@
       <w:tr>
         <w:tc>
           <w:tcPr>
-            <w:tcW w:type="dxa" w:w="5340"/>
+            <w:tcW w:type="dxa" w:w="5342"/>
           </w:tcPr>
           <w:p>
             <w:pPr>
@@ -2040,7 +2040,7 @@
         </w:tc>
         <w:tc>
           <w:tcPr>
-            <w:tcW w:type="dxa" w:w="5340"/>
+            <w:tcW w:type="dxa" w:w="5342"/>
           </w:tcPr>
           <w:p>
             <w:pPr>
@@ -2063,7 +2063,7 @@
       <w:tr>
         <w:tc>
           <w:tcPr>
-            <w:tcW w:type="dxa" w:w="5340"/>
+            <w:tcW w:type="dxa" w:w="5342"/>
           </w:tcPr>
           <w:p>
             <w:pPr>
@@ -2084,7 +2084,7 @@
         </w:tc>
         <w:tc>
           <w:tcPr>
-            <w:tcW w:type="dxa" w:w="5340"/>
+            <w:tcW w:type="dxa" w:w="5342"/>
           </w:tcPr>
           <w:p>
             <w:pPr>
@@ -2107,7 +2107,7 @@
       <w:tr>
         <w:tc>
           <w:tcPr>
-            <w:tcW w:type="dxa" w:w="5340"/>
+            <w:tcW w:type="dxa" w:w="5342"/>
           </w:tcPr>
           <w:p>
             <w:pPr>
@@ -2128,7 +2128,7 @@
         </w:tc>
         <w:tc>
           <w:tcPr>
-            <w:tcW w:type="dxa" w:w="5340"/>
+            <w:tcW w:type="dxa" w:w="5342"/>
           </w:tcPr>
           <w:p>
             <w:pPr>
@@ -2151,7 +2151,7 @@
       <w:tr>
         <w:tc>
           <w:tcPr>
-            <w:tcW w:type="dxa" w:w="5340"/>
+            <w:tcW w:type="dxa" w:w="5342"/>
           </w:tcPr>
           <w:p>
             <w:pPr>
@@ -2172,7 +2172,7 @@
         </w:tc>
         <w:tc>
           <w:tcPr>
-            <w:tcW w:type="dxa" w:w="5340"/>
+            <w:tcW w:type="dxa" w:w="5342"/>
           </w:tcPr>
           <w:p>
             <w:pPr>
@@ -2195,7 +2195,7 @@
       <w:tr>
         <w:tc>
           <w:tcPr>
-            <w:tcW w:type="dxa" w:w="5340"/>
+            <w:tcW w:type="dxa" w:w="5342"/>
           </w:tcPr>
           <w:p>
             <w:pPr>
@@ -2216,7 +2216,7 @@
         </w:tc>
         <w:tc>
           <w:tcPr>
-            <w:tcW w:type="dxa" w:w="5340"/>
+            <w:tcW w:type="dxa" w:w="5342"/>
           </w:tcPr>
           <w:p>
             <w:pPr>
@@ -2239,7 +2239,7 @@
       <w:tr>
         <w:tc>
           <w:tcPr>
-            <w:tcW w:type="dxa" w:w="5340"/>
+            <w:tcW w:type="dxa" w:w="5342"/>
           </w:tcPr>
           <w:p>
             <w:pPr>
@@ -2260,7 +2260,7 @@
         </w:tc>
         <w:tc>
           <w:tcPr>
-            <w:tcW w:type="dxa" w:w="5340"/>
+            <w:tcW w:type="dxa" w:w="5342"/>
           </w:tcPr>
           <w:p>
             <w:pPr>
@@ -2283,7 +2283,7 @@
       <w:tr>
         <w:tc>
           <w:tcPr>
-            <w:tcW w:type="dxa" w:w="5340"/>
+            <w:tcW w:type="dxa" w:w="5342"/>
           </w:tcPr>
           <w:p>
             <w:pPr>
@@ -2304,7 +2304,7 @@
         </w:tc>
         <w:tc>
           <w:tcPr>
-            <w:tcW w:type="dxa" w:w="5340"/>
+            <w:tcW w:type="dxa" w:w="5342"/>
           </w:tcPr>
           <w:p>
             <w:pPr>
@@ -2327,7 +2327,7 @@
       <w:tr>
         <w:tc>
           <w:tcPr>
-            <w:tcW w:type="dxa" w:w="5340"/>
+            <w:tcW w:type="dxa" w:w="5342"/>
           </w:tcPr>
           <w:p>
             <w:pPr>
@@ -2348,7 +2348,7 @@
         </w:tc>
         <w:tc>
           <w:tcPr>
-            <w:tcW w:type="dxa" w:w="5340"/>
+            <w:tcW w:type="dxa" w:w="5342"/>
           </w:tcPr>
           <w:p>
             <w:pPr>
@@ -3354,15 +3354,15 @@
         <w:tblLook w:firstColumn="1" w:firstRow="1" w:lastColumn="0" w:lastRow="0" w:noHBand="0" w:noVBand="1" w:val="04A0"/>
       </w:tblPr>
       <w:tblGrid>
-        <w:gridCol w:w="2670"/>
-        <w:gridCol w:w="2670"/>
-        <w:gridCol w:w="2670"/>
-        <w:gridCol w:w="2670"/>
+        <w:gridCol w:w="2671"/>
+        <w:gridCol w:w="2671"/>
+        <w:gridCol w:w="2671"/>
+        <w:gridCol w:w="2671"/>
       </w:tblGrid>
       <w:tr>
         <w:tc>
           <w:tcPr>
-            <w:tcW w:type="dxa" w:w="2670"/>
+            <w:tcW w:type="dxa" w:w="2671"/>
           </w:tcPr>
           <w:p>
             <w:pPr>
@@ -3383,7 +3383,7 @@
         </w:tc>
         <w:tc>
           <w:tcPr>
-            <w:tcW w:type="dxa" w:w="2670"/>
+            <w:tcW w:type="dxa" w:w="2671"/>
           </w:tcPr>
           <w:p>
             <w:pPr>
@@ -3404,7 +3404,7 @@
         </w:tc>
         <w:tc>
           <w:tcPr>
-            <w:tcW w:type="dxa" w:w="2670"/>
+            <w:tcW w:type="dxa" w:w="2671"/>
           </w:tcPr>
           <w:p>
             <w:pPr>
@@ -3425,7 +3425,7 @@
         </w:tc>
         <w:tc>
           <w:tcPr>
-            <w:tcW w:type="dxa" w:w="2670"/>
+            <w:tcW w:type="dxa" w:w="2671"/>
           </w:tcPr>
           <w:p>
             <w:pPr>
@@ -3448,7 +3448,7 @@
       <w:tr>
         <w:tc>
           <w:tcPr>
-            <w:tcW w:type="dxa" w:w="2670"/>
+            <w:tcW w:type="dxa" w:w="2671"/>
           </w:tcPr>
           <w:p>
             <w:pPr>
@@ -3469,7 +3469,7 @@
         </w:tc>
         <w:tc>
           <w:tcPr>
-            <w:tcW w:type="dxa" w:w="2670"/>
+            <w:tcW w:type="dxa" w:w="2671"/>
           </w:tcPr>
           <w:p>
             <w:pPr>
@@ -3490,7 +3490,7 @@
         </w:tc>
         <w:tc>
           <w:tcPr>
-            <w:tcW w:type="dxa" w:w="2670"/>
+            <w:tcW w:type="dxa" w:w="2671"/>
           </w:tcPr>
           <w:p>
             <w:pPr>
@@ -3511,7 +3511,7 @@
         </w:tc>
         <w:tc>
           <w:tcPr>
-            <w:tcW w:type="dxa" w:w="2670"/>
+            <w:tcW w:type="dxa" w:w="2671"/>
           </w:tcPr>
           <w:p>
             <w:pPr>
@@ -3534,7 +3534,7 @@
       <w:tr>
         <w:tc>
           <w:tcPr>
-            <w:tcW w:type="dxa" w:w="2670"/>
+            <w:tcW w:type="dxa" w:w="2671"/>
           </w:tcPr>
           <w:p>
             <w:pPr>
@@ -3555,7 +3555,7 @@
         </w:tc>
         <w:tc>
           <w:tcPr>
-            <w:tcW w:type="dxa" w:w="2670"/>
+            <w:tcW w:type="dxa" w:w="2671"/>
           </w:tcPr>
           <w:p>
             <w:pPr>
@@ -3576,7 +3576,7 @@
         </w:tc>
         <w:tc>
           <w:tcPr>
-            <w:tcW w:type="dxa" w:w="2670"/>
+            <w:tcW w:type="dxa" w:w="2671"/>
           </w:tcPr>
           <w:p>
             <w:pPr>
@@ -3597,7 +3597,7 @@
         </w:tc>
         <w:tc>
           <w:tcPr>
-            <w:tcW w:type="dxa" w:w="2670"/>
+            <w:tcW w:type="dxa" w:w="2671"/>
           </w:tcPr>
           <w:p>
             <w:pPr>
@@ -3620,7 +3620,7 @@
       <w:tr>
         <w:tc>
           <w:tcPr>
-            <w:tcW w:type="dxa" w:w="2670"/>
+            <w:tcW w:type="dxa" w:w="2671"/>
           </w:tcPr>
           <w:p>
             <w:pPr>
@@ -3641,7 +3641,7 @@
         </w:tc>
         <w:tc>
           <w:tcPr>
-            <w:tcW w:type="dxa" w:w="2670"/>
+            <w:tcW w:type="dxa" w:w="2671"/>
           </w:tcPr>
           <w:p>
             <w:pPr>
@@ -3662,7 +3662,7 @@
         </w:tc>
         <w:tc>
           <w:tcPr>
-            <w:tcW w:type="dxa" w:w="2670"/>
+            <w:tcW w:type="dxa" w:w="2671"/>
           </w:tcPr>
           <w:p>
             <w:pPr>
@@ -3683,7 +3683,7 @@
         </w:tc>
         <w:tc>
           <w:tcPr>
-            <w:tcW w:type="dxa" w:w="2670"/>
+            <w:tcW w:type="dxa" w:w="2671"/>
           </w:tcPr>
           <w:p>
             <w:pPr>
@@ -3706,7 +3706,7 @@
       <w:tr>
         <w:tc>
           <w:tcPr>
-            <w:tcW w:type="dxa" w:w="2670"/>
+            <w:tcW w:type="dxa" w:w="2671"/>
           </w:tcPr>
           <w:p>
             <w:pPr>
@@ -3727,7 +3727,7 @@
         </w:tc>
         <w:tc>
           <w:tcPr>
-            <w:tcW w:type="dxa" w:w="2670"/>
+            <w:tcW w:type="dxa" w:w="2671"/>
           </w:tcPr>
           <w:p>
             <w:pPr>
@@ -3748,7 +3748,7 @@
         </w:tc>
         <w:tc>
           <w:tcPr>
-            <w:tcW w:type="dxa" w:w="2670"/>
+            <w:tcW w:type="dxa" w:w="2671"/>
           </w:tcPr>
           <w:p>
             <w:pPr>
@@ -3769,7 +3769,7 @@
         </w:tc>
         <w:tc>
           <w:tcPr>
-            <w:tcW w:type="dxa" w:w="2670"/>
+            <w:tcW w:type="dxa" w:w="2671"/>
           </w:tcPr>
           <w:p>
             <w:pPr>
@@ -3792,7 +3792,7 @@
       <w:tr>
         <w:tc>
           <w:tcPr>
-            <w:tcW w:type="dxa" w:w="2670"/>
+            <w:tcW w:type="dxa" w:w="2671"/>
           </w:tcPr>
           <w:p>
             <w:pPr>
@@ -3813,7 +3813,7 @@
         </w:tc>
         <w:tc>
           <w:tcPr>
-            <w:tcW w:type="dxa" w:w="2670"/>
+            <w:tcW w:type="dxa" w:w="2671"/>
           </w:tcPr>
           <w:p>
             <w:pPr>
@@ -3834,7 +3834,7 @@
         </w:tc>
         <w:tc>
           <w:tcPr>
-            <w:tcW w:type="dxa" w:w="2670"/>
+            <w:tcW w:type="dxa" w:w="2671"/>
           </w:tcPr>
           <w:p>
             <w:pPr>
@@ -3855,7 +3855,7 @@
         </w:tc>
         <w:tc>
           <w:tcPr>
-            <w:tcW w:type="dxa" w:w="2670"/>
+            <w:tcW w:type="dxa" w:w="2671"/>
           </w:tcPr>
           <w:p>
             <w:pPr>
@@ -3878,7 +3878,7 @@
       <w:tr>
         <w:tc>
           <w:tcPr>
-            <w:tcW w:type="dxa" w:w="2670"/>
+            <w:tcW w:type="dxa" w:w="2671"/>
           </w:tcPr>
           <w:p>
             <w:pPr>
@@ -3899,7 +3899,7 @@
         </w:tc>
         <w:tc>
           <w:tcPr>
-            <w:tcW w:type="dxa" w:w="2670"/>
+            <w:tcW w:type="dxa" w:w="2671"/>
           </w:tcPr>
           <w:p>
             <w:pPr>
@@ -3920,7 +3920,7 @@
         </w:tc>
         <w:tc>
           <w:tcPr>
-            <w:tcW w:type="dxa" w:w="2670"/>
+            <w:tcW w:type="dxa" w:w="2671"/>
           </w:tcPr>
           <w:p>
             <w:pPr>
@@ -3941,7 +3941,7 @@
         </w:tc>
         <w:tc>
           <w:tcPr>
-            <w:tcW w:type="dxa" w:w="2670"/>
+            <w:tcW w:type="dxa" w:w="2671"/>
           </w:tcPr>
           <w:p>
             <w:pPr>
@@ -4598,14 +4598,6 @@
     </w:p>
     <w:p>
       <w:pPr>
-        <w:spacing w:before="0" w:after="0" w:line="240" w:lineRule="auto"/>
-      </w:pPr>
-      <w:r>
-        <w:br w:type="page"/>
-      </w:r>
-    </w:p>
-    <w:p>
-      <w:pPr>
         <w:ind w:left="400"/>
         <w:jc w:val="center"/>
       </w:pPr>
@@ -5441,7 +5433,7 @@
     <w:sectPr>
       <w:type w:val="continuous"/>
       <w:pgSz w:w="12240" w:h="15840"/>
-      <w:pgMar w:top="380" w:right="1100" w:bottom="280" w:left="460" w:header="720" w:footer="720" w:gutter="0"/>
+      <w:pgMar w:top="374" w:right="1094" w:bottom="274" w:left="461" w:header="720" w:footer="720" w:gutter="0"/>
       <w:cols w:space="720"/>
     </w:sectPr>
   </w:body>

</xml_diff>

<commit_message>
fix: replace kubectl with kubeconform for CI manifest validation
kubectl apply --dry-run=client requires a kubeconfig/cluster even with
--validate=false, which doesn't exist in CI. kubeconform validates
manifests against K8s JSON schemas offline — no cluster needed.
</commit_message>
<xml_diff>
--- a/report_output/RoomEase_CICD_Project_Report.docx
+++ b/report_output/RoomEase_CICD_Project_Report.docx
@@ -1837,13 +1837,13 @@
         <w:tblLook w:firstColumn="1" w:firstRow="1" w:lastColumn="0" w:lastRow="0" w:noHBand="0" w:noVBand="1" w:val="04A0"/>
       </w:tblPr>
       <w:tblGrid>
-        <w:gridCol w:w="5342"/>
-        <w:gridCol w:w="5342"/>
+        <w:gridCol w:w="5175"/>
+        <w:gridCol w:w="5175"/>
       </w:tblGrid>
       <w:tr>
         <w:tc>
           <w:tcPr>
-            <w:tcW w:type="dxa" w:w="5342"/>
+            <w:tcW w:type="dxa" w:w="5175"/>
           </w:tcPr>
           <w:p>
             <w:pPr>
@@ -1864,7 +1864,7 @@
         </w:tc>
         <w:tc>
           <w:tcPr>
-            <w:tcW w:type="dxa" w:w="5342"/>
+            <w:tcW w:type="dxa" w:w="5175"/>
           </w:tcPr>
           <w:p>
             <w:pPr>
@@ -1887,7 +1887,7 @@
       <w:tr>
         <w:tc>
           <w:tcPr>
-            <w:tcW w:type="dxa" w:w="5342"/>
+            <w:tcW w:type="dxa" w:w="5175"/>
           </w:tcPr>
           <w:p>
             <w:pPr>
@@ -1908,7 +1908,7 @@
         </w:tc>
         <w:tc>
           <w:tcPr>
-            <w:tcW w:type="dxa" w:w="5342"/>
+            <w:tcW w:type="dxa" w:w="5175"/>
           </w:tcPr>
           <w:p>
             <w:pPr>
@@ -1931,7 +1931,7 @@
       <w:tr>
         <w:tc>
           <w:tcPr>
-            <w:tcW w:type="dxa" w:w="5342"/>
+            <w:tcW w:type="dxa" w:w="5175"/>
           </w:tcPr>
           <w:p>
             <w:pPr>
@@ -1952,7 +1952,7 @@
         </w:tc>
         <w:tc>
           <w:tcPr>
-            <w:tcW w:type="dxa" w:w="5342"/>
+            <w:tcW w:type="dxa" w:w="5175"/>
           </w:tcPr>
           <w:p>
             <w:pPr>
@@ -1975,7 +1975,7 @@
       <w:tr>
         <w:tc>
           <w:tcPr>
-            <w:tcW w:type="dxa" w:w="5342"/>
+            <w:tcW w:type="dxa" w:w="5175"/>
           </w:tcPr>
           <w:p>
             <w:pPr>
@@ -1996,7 +1996,7 @@
         </w:tc>
         <w:tc>
           <w:tcPr>
-            <w:tcW w:type="dxa" w:w="5342"/>
+            <w:tcW w:type="dxa" w:w="5175"/>
           </w:tcPr>
           <w:p>
             <w:pPr>
@@ -2019,7 +2019,7 @@
       <w:tr>
         <w:tc>
           <w:tcPr>
-            <w:tcW w:type="dxa" w:w="5342"/>
+            <w:tcW w:type="dxa" w:w="5175"/>
           </w:tcPr>
           <w:p>
             <w:pPr>
@@ -2040,7 +2040,7 @@
         </w:tc>
         <w:tc>
           <w:tcPr>
-            <w:tcW w:type="dxa" w:w="5342"/>
+            <w:tcW w:type="dxa" w:w="5175"/>
           </w:tcPr>
           <w:p>
             <w:pPr>
@@ -2063,7 +2063,7 @@
       <w:tr>
         <w:tc>
           <w:tcPr>
-            <w:tcW w:type="dxa" w:w="5342"/>
+            <w:tcW w:type="dxa" w:w="5175"/>
           </w:tcPr>
           <w:p>
             <w:pPr>
@@ -2084,7 +2084,7 @@
         </w:tc>
         <w:tc>
           <w:tcPr>
-            <w:tcW w:type="dxa" w:w="5342"/>
+            <w:tcW w:type="dxa" w:w="5175"/>
           </w:tcPr>
           <w:p>
             <w:pPr>
@@ -2107,7 +2107,7 @@
       <w:tr>
         <w:tc>
           <w:tcPr>
-            <w:tcW w:type="dxa" w:w="5342"/>
+            <w:tcW w:type="dxa" w:w="5175"/>
           </w:tcPr>
           <w:p>
             <w:pPr>
@@ -2128,7 +2128,7 @@
         </w:tc>
         <w:tc>
           <w:tcPr>
-            <w:tcW w:type="dxa" w:w="5342"/>
+            <w:tcW w:type="dxa" w:w="5175"/>
           </w:tcPr>
           <w:p>
             <w:pPr>
@@ -2151,7 +2151,7 @@
       <w:tr>
         <w:tc>
           <w:tcPr>
-            <w:tcW w:type="dxa" w:w="5342"/>
+            <w:tcW w:type="dxa" w:w="5175"/>
           </w:tcPr>
           <w:p>
             <w:pPr>
@@ -2172,7 +2172,7 @@
         </w:tc>
         <w:tc>
           <w:tcPr>
-            <w:tcW w:type="dxa" w:w="5342"/>
+            <w:tcW w:type="dxa" w:w="5175"/>
           </w:tcPr>
           <w:p>
             <w:pPr>
@@ -2195,7 +2195,7 @@
       <w:tr>
         <w:tc>
           <w:tcPr>
-            <w:tcW w:type="dxa" w:w="5342"/>
+            <w:tcW w:type="dxa" w:w="5175"/>
           </w:tcPr>
           <w:p>
             <w:pPr>
@@ -2216,7 +2216,7 @@
         </w:tc>
         <w:tc>
           <w:tcPr>
-            <w:tcW w:type="dxa" w:w="5342"/>
+            <w:tcW w:type="dxa" w:w="5175"/>
           </w:tcPr>
           <w:p>
             <w:pPr>
@@ -2239,7 +2239,7 @@
       <w:tr>
         <w:tc>
           <w:tcPr>
-            <w:tcW w:type="dxa" w:w="5342"/>
+            <w:tcW w:type="dxa" w:w="5175"/>
           </w:tcPr>
           <w:p>
             <w:pPr>
@@ -2260,7 +2260,7 @@
         </w:tc>
         <w:tc>
           <w:tcPr>
-            <w:tcW w:type="dxa" w:w="5342"/>
+            <w:tcW w:type="dxa" w:w="5175"/>
           </w:tcPr>
           <w:p>
             <w:pPr>
@@ -2283,7 +2283,7 @@
       <w:tr>
         <w:tc>
           <w:tcPr>
-            <w:tcW w:type="dxa" w:w="5342"/>
+            <w:tcW w:type="dxa" w:w="5175"/>
           </w:tcPr>
           <w:p>
             <w:pPr>
@@ -2304,7 +2304,7 @@
         </w:tc>
         <w:tc>
           <w:tcPr>
-            <w:tcW w:type="dxa" w:w="5342"/>
+            <w:tcW w:type="dxa" w:w="5175"/>
           </w:tcPr>
           <w:p>
             <w:pPr>
@@ -2327,7 +2327,7 @@
       <w:tr>
         <w:tc>
           <w:tcPr>
-            <w:tcW w:type="dxa" w:w="5342"/>
+            <w:tcW w:type="dxa" w:w="5175"/>
           </w:tcPr>
           <w:p>
             <w:pPr>
@@ -2348,7 +2348,7 @@
         </w:tc>
         <w:tc>
           <w:tcPr>
-            <w:tcW w:type="dxa" w:w="5342"/>
+            <w:tcW w:type="dxa" w:w="5175"/>
           </w:tcPr>
           <w:p>
             <w:pPr>
@@ -3354,15 +3354,15 @@
         <w:tblLook w:firstColumn="1" w:firstRow="1" w:lastColumn="0" w:lastRow="0" w:noHBand="0" w:noVBand="1" w:val="04A0"/>
       </w:tblPr>
       <w:tblGrid>
-        <w:gridCol w:w="2671"/>
-        <w:gridCol w:w="2671"/>
-        <w:gridCol w:w="2671"/>
-        <w:gridCol w:w="2671"/>
+        <w:gridCol w:w="2588"/>
+        <w:gridCol w:w="2588"/>
+        <w:gridCol w:w="2588"/>
+        <w:gridCol w:w="2588"/>
       </w:tblGrid>
       <w:tr>
         <w:tc>
           <w:tcPr>
-            <w:tcW w:type="dxa" w:w="2671"/>
+            <w:tcW w:type="dxa" w:w="2588"/>
           </w:tcPr>
           <w:p>
             <w:pPr>
@@ -3383,7 +3383,7 @@
         </w:tc>
         <w:tc>
           <w:tcPr>
-            <w:tcW w:type="dxa" w:w="2671"/>
+            <w:tcW w:type="dxa" w:w="2588"/>
           </w:tcPr>
           <w:p>
             <w:pPr>
@@ -3404,7 +3404,7 @@
         </w:tc>
         <w:tc>
           <w:tcPr>
-            <w:tcW w:type="dxa" w:w="2671"/>
+            <w:tcW w:type="dxa" w:w="2588"/>
           </w:tcPr>
           <w:p>
             <w:pPr>
@@ -3425,7 +3425,7 @@
         </w:tc>
         <w:tc>
           <w:tcPr>
-            <w:tcW w:type="dxa" w:w="2671"/>
+            <w:tcW w:type="dxa" w:w="2588"/>
           </w:tcPr>
           <w:p>
             <w:pPr>
@@ -3448,7 +3448,7 @@
       <w:tr>
         <w:tc>
           <w:tcPr>
-            <w:tcW w:type="dxa" w:w="2671"/>
+            <w:tcW w:type="dxa" w:w="2588"/>
           </w:tcPr>
           <w:p>
             <w:pPr>
@@ -3469,7 +3469,7 @@
         </w:tc>
         <w:tc>
           <w:tcPr>
-            <w:tcW w:type="dxa" w:w="2671"/>
+            <w:tcW w:type="dxa" w:w="2588"/>
           </w:tcPr>
           <w:p>
             <w:pPr>
@@ -3490,7 +3490,7 @@
         </w:tc>
         <w:tc>
           <w:tcPr>
-            <w:tcW w:type="dxa" w:w="2671"/>
+            <w:tcW w:type="dxa" w:w="2588"/>
           </w:tcPr>
           <w:p>
             <w:pPr>
@@ -3511,7 +3511,7 @@
         </w:tc>
         <w:tc>
           <w:tcPr>
-            <w:tcW w:type="dxa" w:w="2671"/>
+            <w:tcW w:type="dxa" w:w="2588"/>
           </w:tcPr>
           <w:p>
             <w:pPr>
@@ -3534,7 +3534,7 @@
       <w:tr>
         <w:tc>
           <w:tcPr>
-            <w:tcW w:type="dxa" w:w="2671"/>
+            <w:tcW w:type="dxa" w:w="2588"/>
           </w:tcPr>
           <w:p>
             <w:pPr>
@@ -3555,7 +3555,7 @@
         </w:tc>
         <w:tc>
           <w:tcPr>
-            <w:tcW w:type="dxa" w:w="2671"/>
+            <w:tcW w:type="dxa" w:w="2588"/>
           </w:tcPr>
           <w:p>
             <w:pPr>
@@ -3576,7 +3576,7 @@
         </w:tc>
         <w:tc>
           <w:tcPr>
-            <w:tcW w:type="dxa" w:w="2671"/>
+            <w:tcW w:type="dxa" w:w="2588"/>
           </w:tcPr>
           <w:p>
             <w:pPr>
@@ -3597,7 +3597,7 @@
         </w:tc>
         <w:tc>
           <w:tcPr>
-            <w:tcW w:type="dxa" w:w="2671"/>
+            <w:tcW w:type="dxa" w:w="2588"/>
           </w:tcPr>
           <w:p>
             <w:pPr>
@@ -3620,7 +3620,7 @@
       <w:tr>
         <w:tc>
           <w:tcPr>
-            <w:tcW w:type="dxa" w:w="2671"/>
+            <w:tcW w:type="dxa" w:w="2588"/>
           </w:tcPr>
           <w:p>
             <w:pPr>
@@ -3641,7 +3641,7 @@
         </w:tc>
         <w:tc>
           <w:tcPr>
-            <w:tcW w:type="dxa" w:w="2671"/>
+            <w:tcW w:type="dxa" w:w="2588"/>
           </w:tcPr>
           <w:p>
             <w:pPr>
@@ -3662,7 +3662,7 @@
         </w:tc>
         <w:tc>
           <w:tcPr>
-            <w:tcW w:type="dxa" w:w="2671"/>
+            <w:tcW w:type="dxa" w:w="2588"/>
           </w:tcPr>
           <w:p>
             <w:pPr>
@@ -3683,7 +3683,7 @@
         </w:tc>
         <w:tc>
           <w:tcPr>
-            <w:tcW w:type="dxa" w:w="2671"/>
+            <w:tcW w:type="dxa" w:w="2588"/>
           </w:tcPr>
           <w:p>
             <w:pPr>
@@ -3706,7 +3706,7 @@
       <w:tr>
         <w:tc>
           <w:tcPr>
-            <w:tcW w:type="dxa" w:w="2671"/>
+            <w:tcW w:type="dxa" w:w="2588"/>
           </w:tcPr>
           <w:p>
             <w:pPr>
@@ -3727,7 +3727,7 @@
         </w:tc>
         <w:tc>
           <w:tcPr>
-            <w:tcW w:type="dxa" w:w="2671"/>
+            <w:tcW w:type="dxa" w:w="2588"/>
           </w:tcPr>
           <w:p>
             <w:pPr>
@@ -3748,7 +3748,7 @@
         </w:tc>
         <w:tc>
           <w:tcPr>
-            <w:tcW w:type="dxa" w:w="2671"/>
+            <w:tcW w:type="dxa" w:w="2588"/>
           </w:tcPr>
           <w:p>
             <w:pPr>
@@ -3769,7 +3769,7 @@
         </w:tc>
         <w:tc>
           <w:tcPr>
-            <w:tcW w:type="dxa" w:w="2671"/>
+            <w:tcW w:type="dxa" w:w="2588"/>
           </w:tcPr>
           <w:p>
             <w:pPr>
@@ -3792,7 +3792,7 @@
       <w:tr>
         <w:tc>
           <w:tcPr>
-            <w:tcW w:type="dxa" w:w="2671"/>
+            <w:tcW w:type="dxa" w:w="2588"/>
           </w:tcPr>
           <w:p>
             <w:pPr>
@@ -3813,7 +3813,7 @@
         </w:tc>
         <w:tc>
           <w:tcPr>
-            <w:tcW w:type="dxa" w:w="2671"/>
+            <w:tcW w:type="dxa" w:w="2588"/>
           </w:tcPr>
           <w:p>
             <w:pPr>
@@ -3834,7 +3834,7 @@
         </w:tc>
         <w:tc>
           <w:tcPr>
-            <w:tcW w:type="dxa" w:w="2671"/>
+            <w:tcW w:type="dxa" w:w="2588"/>
           </w:tcPr>
           <w:p>
             <w:pPr>
@@ -3855,7 +3855,7 @@
         </w:tc>
         <w:tc>
           <w:tcPr>
-            <w:tcW w:type="dxa" w:w="2671"/>
+            <w:tcW w:type="dxa" w:w="2588"/>
           </w:tcPr>
           <w:p>
             <w:pPr>
@@ -3878,7 +3878,7 @@
       <w:tr>
         <w:tc>
           <w:tcPr>
-            <w:tcW w:type="dxa" w:w="2671"/>
+            <w:tcW w:type="dxa" w:w="2588"/>
           </w:tcPr>
           <w:p>
             <w:pPr>
@@ -3899,7 +3899,7 @@
         </w:tc>
         <w:tc>
           <w:tcPr>
-            <w:tcW w:type="dxa" w:w="2671"/>
+            <w:tcW w:type="dxa" w:w="2588"/>
           </w:tcPr>
           <w:p>
             <w:pPr>
@@ -3920,7 +3920,7 @@
         </w:tc>
         <w:tc>
           <w:tcPr>
-            <w:tcW w:type="dxa" w:w="2671"/>
+            <w:tcW w:type="dxa" w:w="2588"/>
           </w:tcPr>
           <w:p>
             <w:pPr>
@@ -3941,7 +3941,7 @@
         </w:tc>
         <w:tc>
           <w:tcPr>
-            <w:tcW w:type="dxa" w:w="2671"/>
+            <w:tcW w:type="dxa" w:w="2588"/>
           </w:tcPr>
           <w:p>
             <w:pPr>
@@ -5432,7 +5432,7 @@
     </w:p>
     <w:sectPr>
       <w:type w:val="continuous"/>
-      <w:pgSz w:w="12240" w:h="15840"/>
+      <w:pgSz w:w="11906" w:h="16838"/>
       <w:pgMar w:top="374" w:right="1094" w:bottom="274" w:left="461" w:header="720" w:footer="720" w:gutter="0"/>
       <w:cols w:space="720"/>
     </w:sectPr>

</xml_diff>